<commit_message>
HU Login: corrige mensaje de credenciales invalidas, agrega escenario Usuario bloqueado y limpia typos; renombra plan de Login
</commit_message>
<xml_diff>
--- a/01 - Analisis funcional/Login/Historias de usuario - Login.docx
+++ b/01 - Analisis funcional/Login/Historias de usuario - Login.docx
@@ -88,455 +88,61 @@
           <w:i/>
           <w:iCs/>
         </w:rPr>
-        <w:t>Nota</w:t>
+        <w:t>Nota: Como SauceDemo es una aplicación pública de práctica, no existen historias de usuario oficiales de un cliente. Estas HU las definí como analista funcional, a partir de la exploración de la aplicación y de estándares comunes de autenticación. Definen el comportamiento esperado que luego se valida con los Casos de prueba.</w:t>
       </w:r>
       <w:proofErr w:type="spellEnd"/>
-      <w:r>
-        <w:rPr>
-          <w:b/>
-          <w:bCs/>
-          <w:i/>
-          <w:iCs/>
-        </w:rPr>
-        <w:t>:</w:t>
-      </w:r>
-      <w:r>
-        <w:rPr>
-          <w:i/>
-          <w:iCs/>
-        </w:rPr>
-        <w:t xml:space="preserve"> Como </w:t>
-      </w:r>
       <w:proofErr w:type="spellStart"/>
-      <w:r>
-        <w:rPr>
-          <w:i/>
-          <w:iCs/>
-        </w:rPr>
-        <w:t>SauceDemo</w:t>
-      </w:r>
       <w:proofErr w:type="spellEnd"/>
-      <w:r>
-        <w:rPr>
-          <w:i/>
-          <w:iCs/>
-        </w:rPr>
-        <w:t xml:space="preserve"> es </w:t>
-      </w:r>
       <w:proofErr w:type="spellStart"/>
-      <w:r>
-        <w:rPr>
-          <w:i/>
-          <w:iCs/>
-        </w:rPr>
-        <w:t>una</w:t>
-      </w:r>
       <w:proofErr w:type="spellEnd"/>
-      <w:r>
-        <w:rPr>
-          <w:i/>
-          <w:iCs/>
-        </w:rPr>
-        <w:t xml:space="preserve"> </w:t>
-      </w:r>
       <w:proofErr w:type="spellStart"/>
-      <w:r>
-        <w:rPr>
-          <w:i/>
-          <w:iCs/>
-        </w:rPr>
-        <w:t>aplicación</w:t>
-      </w:r>
       <w:proofErr w:type="spellEnd"/>
-      <w:r>
-        <w:rPr>
-          <w:i/>
-          <w:iCs/>
-        </w:rPr>
-        <w:t xml:space="preserve"> </w:t>
-      </w:r>
       <w:proofErr w:type="spellStart"/>
-      <w:r>
-        <w:rPr>
-          <w:i/>
-          <w:iCs/>
-        </w:rPr>
-        <w:t>pública</w:t>
-      </w:r>
       <w:proofErr w:type="spellEnd"/>
-      <w:r>
-        <w:rPr>
-          <w:i/>
-          <w:iCs/>
-        </w:rPr>
-        <w:t xml:space="preserve"> de </w:t>
-      </w:r>
       <w:proofErr w:type="spellStart"/>
-      <w:r>
-        <w:rPr>
-          <w:i/>
-          <w:iCs/>
-        </w:rPr>
-        <w:t>práctica</w:t>
-      </w:r>
       <w:proofErr w:type="spellEnd"/>
-      <w:r>
-        <w:rPr>
-          <w:i/>
-          <w:iCs/>
-        </w:rPr>
-        <w:t xml:space="preserve">, no </w:t>
-      </w:r>
       <w:proofErr w:type="spellStart"/>
-      <w:r>
-        <w:rPr>
-          <w:i/>
-          <w:iCs/>
-        </w:rPr>
-        <w:t>existen</w:t>
-      </w:r>
       <w:proofErr w:type="spellEnd"/>
-      <w:r>
-        <w:rPr>
-          <w:i/>
-          <w:iCs/>
-        </w:rPr>
-        <w:t xml:space="preserve"> </w:t>
-      </w:r>
       <w:proofErr w:type="spellStart"/>
-      <w:r>
-        <w:rPr>
-          <w:i/>
-          <w:iCs/>
-        </w:rPr>
-        <w:t>historias</w:t>
-      </w:r>
       <w:proofErr w:type="spellEnd"/>
-      <w:r>
-        <w:rPr>
-          <w:i/>
-          <w:iCs/>
-        </w:rPr>
-        <w:t xml:space="preserve"> de usuario </w:t>
-      </w:r>
       <w:proofErr w:type="spellStart"/>
-      <w:r>
-        <w:rPr>
-          <w:i/>
-          <w:iCs/>
-        </w:rPr>
-        <w:t>oficiales</w:t>
-      </w:r>
       <w:proofErr w:type="spellEnd"/>
-      <w:r>
-        <w:rPr>
-          <w:i/>
-          <w:iCs/>
-        </w:rPr>
-        <w:t xml:space="preserve"> de un </w:t>
-      </w:r>
       <w:proofErr w:type="spellStart"/>
-      <w:r>
-        <w:rPr>
-          <w:i/>
-          <w:iCs/>
-        </w:rPr>
-        <w:t>cliente</w:t>
-      </w:r>
       <w:proofErr w:type="spellEnd"/>
-      <w:r>
-        <w:rPr>
-          <w:i/>
-          <w:iCs/>
-        </w:rPr>
-        <w:t xml:space="preserve">. </w:t>
-      </w:r>
       <w:proofErr w:type="spellStart"/>
-      <w:r>
-        <w:rPr>
-          <w:i/>
-          <w:iCs/>
-        </w:rPr>
-        <w:t>Estás</w:t>
-      </w:r>
       <w:proofErr w:type="spellEnd"/>
-      <w:r>
-        <w:rPr>
-          <w:i/>
-          <w:iCs/>
-        </w:rPr>
-        <w:t xml:space="preserve"> HU las define </w:t>
-      </w:r>
       <w:proofErr w:type="spellStart"/>
-      <w:r>
-        <w:rPr>
-          <w:i/>
-          <w:iCs/>
-        </w:rPr>
-        <w:t>como</w:t>
-      </w:r>
       <w:proofErr w:type="spellEnd"/>
-      <w:r>
-        <w:rPr>
-          <w:i/>
-          <w:iCs/>
-        </w:rPr>
-        <w:t xml:space="preserve"> </w:t>
-      </w:r>
       <w:proofErr w:type="spellStart"/>
-      <w:r>
-        <w:rPr>
-          <w:i/>
-          <w:iCs/>
-        </w:rPr>
-        <w:t>analista</w:t>
-      </w:r>
       <w:proofErr w:type="spellEnd"/>
-      <w:r>
-        <w:rPr>
-          <w:i/>
-          <w:iCs/>
-        </w:rPr>
-        <w:t xml:space="preserve"> </w:t>
-      </w:r>
       <w:proofErr w:type="spellStart"/>
-      <w:r>
-        <w:rPr>
-          <w:i/>
-          <w:iCs/>
-        </w:rPr>
-        <w:t>funcional</w:t>
-      </w:r>
       <w:proofErr w:type="spellEnd"/>
-      <w:r>
-        <w:rPr>
-          <w:i/>
-          <w:iCs/>
-        </w:rPr>
-        <w:t xml:space="preserve">, a </w:t>
-      </w:r>
       <w:proofErr w:type="spellStart"/>
-      <w:r>
-        <w:rPr>
-          <w:i/>
-          <w:iCs/>
-        </w:rPr>
-        <w:t>partir</w:t>
-      </w:r>
       <w:proofErr w:type="spellEnd"/>
-      <w:r>
-        <w:rPr>
-          <w:i/>
-          <w:iCs/>
-        </w:rPr>
-        <w:t xml:space="preserve"> de la </w:t>
-      </w:r>
       <w:proofErr w:type="spellStart"/>
-      <w:r>
-        <w:rPr>
-          <w:i/>
-          <w:iCs/>
-        </w:rPr>
-        <w:t>exploración</w:t>
-      </w:r>
       <w:proofErr w:type="spellEnd"/>
-      <w:r>
-        <w:rPr>
-          <w:i/>
-          <w:iCs/>
-        </w:rPr>
-        <w:t xml:space="preserve"> de la </w:t>
-      </w:r>
       <w:proofErr w:type="spellStart"/>
-      <w:r>
-        <w:rPr>
-          <w:i/>
-          <w:iCs/>
-        </w:rPr>
-        <w:t>aplicación</w:t>
-      </w:r>
       <w:proofErr w:type="spellEnd"/>
-      <w:r>
-        <w:rPr>
-          <w:i/>
-          <w:iCs/>
-        </w:rPr>
-        <w:t xml:space="preserve"> y de </w:t>
-      </w:r>
       <w:proofErr w:type="spellStart"/>
-      <w:r>
-        <w:rPr>
-          <w:i/>
-          <w:iCs/>
-        </w:rPr>
-        <w:t>estándares</w:t>
-      </w:r>
       <w:proofErr w:type="spellEnd"/>
-      <w:r>
-        <w:rPr>
-          <w:i/>
-          <w:iCs/>
-        </w:rPr>
-        <w:t xml:space="preserve"> </w:t>
-      </w:r>
       <w:proofErr w:type="spellStart"/>
-      <w:r>
-        <w:rPr>
-          <w:i/>
-          <w:iCs/>
-        </w:rPr>
-        <w:t>comunes</w:t>
-      </w:r>
       <w:proofErr w:type="spellEnd"/>
-      <w:r>
-        <w:rPr>
-          <w:i/>
-          <w:iCs/>
-        </w:rPr>
-        <w:t xml:space="preserve"> de </w:t>
-      </w:r>
       <w:proofErr w:type="spellStart"/>
-      <w:r>
-        <w:rPr>
-          <w:i/>
-          <w:iCs/>
-        </w:rPr>
-        <w:t>autenticación</w:t>
-      </w:r>
       <w:proofErr w:type="spellEnd"/>
-      <w:r>
-        <w:rPr>
-          <w:i/>
-          <w:iCs/>
-        </w:rPr>
-        <w:t xml:space="preserve">. </w:t>
-      </w:r>
       <w:proofErr w:type="spellStart"/>
-      <w:r>
-        <w:rPr>
-          <w:b/>
-          <w:bCs/>
-          <w:i/>
-          <w:iCs/>
-        </w:rPr>
-        <w:t>Definen</w:t>
-      </w:r>
       <w:proofErr w:type="spellEnd"/>
-      <w:r>
-        <w:rPr>
-          <w:b/>
-          <w:bCs/>
-          <w:i/>
-          <w:iCs/>
-        </w:rPr>
-        <w:t xml:space="preserve"> </w:t>
-      </w:r>
       <w:proofErr w:type="spellStart"/>
-      <w:r>
-        <w:rPr>
-          <w:b/>
-          <w:bCs/>
-          <w:i/>
-          <w:iCs/>
-        </w:rPr>
-        <w:t>el</w:t>
-      </w:r>
       <w:proofErr w:type="spellEnd"/>
-      <w:r>
-        <w:rPr>
-          <w:b/>
-          <w:bCs/>
-          <w:i/>
-          <w:iCs/>
-        </w:rPr>
-        <w:t xml:space="preserve"> </w:t>
-      </w:r>
       <w:proofErr w:type="spellStart"/>
-      <w:r>
-        <w:rPr>
-          <w:b/>
-          <w:bCs/>
-          <w:i/>
-          <w:iCs/>
-        </w:rPr>
-        <w:t>comportamiento</w:t>
-      </w:r>
       <w:proofErr w:type="spellEnd"/>
-      <w:r>
-        <w:rPr>
-          <w:b/>
-          <w:bCs/>
-          <w:i/>
-          <w:iCs/>
-        </w:rPr>
-        <w:t xml:space="preserve"> </w:t>
-      </w:r>
       <w:proofErr w:type="spellStart"/>
-      <w:r>
-        <w:rPr>
-          <w:b/>
-          <w:bCs/>
-          <w:i/>
-          <w:iCs/>
-        </w:rPr>
-        <w:t>esperado</w:t>
-      </w:r>
       <w:proofErr w:type="spellEnd"/>
-      <w:r>
-        <w:rPr>
-          <w:i/>
-          <w:iCs/>
-        </w:rPr>
-        <w:t xml:space="preserve"> que luego se </w:t>
-      </w:r>
       <w:proofErr w:type="spellStart"/>
-      <w:r>
-        <w:rPr>
-          <w:i/>
-          <w:iCs/>
-        </w:rPr>
-        <w:t>valida</w:t>
-      </w:r>
       <w:proofErr w:type="spellEnd"/>
-      <w:r>
-        <w:rPr>
-          <w:i/>
-          <w:iCs/>
-        </w:rPr>
-        <w:t xml:space="preserve"> con </w:t>
-      </w:r>
       <w:proofErr w:type="spellStart"/>
-      <w:r>
-        <w:rPr>
-          <w:i/>
-          <w:iCs/>
-        </w:rPr>
-        <w:t>los</w:t>
-      </w:r>
       <w:proofErr w:type="spellEnd"/>
-      <w:r>
-        <w:rPr>
-          <w:i/>
-          <w:iCs/>
-        </w:rPr>
-        <w:t xml:space="preserve"> Casos de </w:t>
-      </w:r>
       <w:proofErr w:type="spellStart"/>
-      <w:r>
-        <w:rPr>
-          <w:i/>
-          <w:iCs/>
-        </w:rPr>
-        <w:t>prueba</w:t>
-      </w:r>
       <w:proofErr w:type="spellEnd"/>
-      <w:r>
-        <w:rPr>
-          <w:i/>
-          <w:iCs/>
-        </w:rPr>
-        <w:t>.</w:t>
-      </w:r>
     </w:p>
     <w:p/>
     <w:tbl>
@@ -861,36 +467,12 @@
               <w:rPr>
                 <w:highlight w:val="white"/>
               </w:rPr>
-              <w:t xml:space="preserve">El usuario, se </w:t>
-            </w:r>
-            <w:proofErr w:type="spellStart"/>
-            <w:r>
-              <w:rPr>
-                <w:highlight w:val="white"/>
-              </w:rPr>
-              <w:t>encuentra</w:t>
-            </w:r>
-            <w:proofErr w:type="spellEnd"/>
-            <w:r>
-              <w:rPr>
-                <w:highlight w:val="white"/>
-              </w:rPr>
-              <w:t xml:space="preserve"> </w:t>
-            </w:r>
-            <w:proofErr w:type="spellStart"/>
-            <w:r>
-              <w:rPr>
-                <w:highlight w:val="white"/>
-              </w:rPr>
-              <w:t>en</w:t>
-            </w:r>
-            <w:proofErr w:type="spellEnd"/>
-            <w:r>
-              <w:rPr>
-                <w:highlight w:val="white"/>
-              </w:rPr>
-              <w:t xml:space="preserve"> la vista de login</w:t>
-            </w:r>
+              <w:t>El usuario se encuentra en la vista de login</w:t>
+            </w:r>
+            <w:proofErr w:type="spellStart"/>
+            <w:proofErr w:type="spellEnd"/>
+            <w:proofErr w:type="spellStart"/>
+            <w:proofErr w:type="spellEnd"/>
           </w:p>
         </w:tc>
       </w:tr>
@@ -996,39 +578,15 @@
               <w:rPr>
                 <w:highlight w:val="white"/>
               </w:rPr>
-              <w:t xml:space="preserve">El </w:t>
+              <w:t>El usuario ingresa credenciales inválidas (usuario o contraseña incorrectos) y da clic sobre el botón Login</w:t>
             </w:r>
             <w:proofErr w:type="gramStart"/>
-            <w:r>
-              <w:rPr>
-                <w:highlight w:val="white"/>
-              </w:rPr>
-              <w:t xml:space="preserve">usuario  </w:t>
-            </w:r>
-            <w:proofErr w:type="spellStart"/>
-            <w:r>
-              <w:rPr>
-                <w:highlight w:val="white"/>
-              </w:rPr>
-              <w:t>ingresa</w:t>
-            </w:r>
+            <w:proofErr w:type="spellStart"/>
             <w:proofErr w:type="spellEnd"/>
             <w:proofErr w:type="gramEnd"/>
-            <w:r>
-              <w:t xml:space="preserve"> las </w:t>
-            </w:r>
-            <w:proofErr w:type="spellStart"/>
-            <w:r>
-              <w:t>credenciales</w:t>
-            </w:r>
-            <w:proofErr w:type="spellEnd"/>
-            <w:r>
-              <w:t xml:space="preserve"> </w:t>
-            </w:r>
-            <w:proofErr w:type="spellStart"/>
-            <w:r>
-              <w:t>incorrectas</w:t>
-            </w:r>
+            <w:proofErr w:type="spellStart"/>
+            <w:proofErr w:type="spellEnd"/>
+            <w:proofErr w:type="spellStart"/>
             <w:proofErr w:type="spellEnd"/>
           </w:p>
         </w:tc>
@@ -1144,58 +702,546 @@
                 <w:color w:val="000000"/>
                 <w:highlight w:val="white"/>
               </w:rPr>
-              <w:t xml:space="preserve">El </w:t>
-            </w:r>
-            <w:proofErr w:type="spellStart"/>
-            <w:r>
+              <w:t>El sistema muestra el mensaje "Username and password do not match any user in this service."</w:t>
+            </w:r>
+            <w:proofErr w:type="spellStart"/>
+            <w:proofErr w:type="spellEnd"/>
+            <w:proofErr w:type="spellStart"/>
+            <w:proofErr w:type="spellEnd"/>
+            <w:proofErr w:type="spellStart"/>
+            <w:proofErr w:type="spellEnd"/>
+          </w:p>
+        </w:tc>
+      </w:tr>
+    </w:tbl>
+    <w:p/>
+    <w:tbl>
+      <w:tblPr>
+        <w:tblStyle w:val="a"/>
+        <w:tblW w:w="10308" w:type="dxa"/>
+        <w:tblInd w:w="-102" w:type="dxa"/>
+        <w:tblBorders>
+          <w:top w:val="nil"/>
+          <w:left w:val="nil"/>
+          <w:bottom w:val="nil"/>
+          <w:right w:val="nil"/>
+          <w:insideH w:val="nil"/>
+          <w:insideV w:val="nil"/>
+        </w:tblBorders>
+        <w:tblLayout w:type="fixed"/>
+        <w:tblLook w:val="0600" w:firstRow="0" w:lastRow="0" w:firstColumn="0" w:lastColumn="0" w:noHBand="1" w:noVBand="1"/>
+      </w:tblPr>
+      <w:tblGrid>
+        <w:gridCol w:w="1560"/>
+        <w:gridCol w:w="1110"/>
+        <w:gridCol w:w="2295"/>
+        <w:gridCol w:w="1500"/>
+        <w:gridCol w:w="3843"/>
+      </w:tblGrid>
+      <w:tr>
+        <w:trPr>
+          <w:trHeight w:val="735"/>
+        </w:trPr>
+        <w:tc>
+          <w:tcPr>
+            <w:tcW w:w="1560" w:type="dxa"/>
+            <w:tcBorders>
+              <w:top w:val="single" w:sz="5" w:space="0" w:color="000000"/>
+              <w:left w:val="single" w:sz="5" w:space="0" w:color="000000"/>
+              <w:bottom w:val="single" w:sz="5" w:space="0" w:color="000000"/>
+              <w:right w:val="single" w:sz="5" w:space="0" w:color="000000"/>
+            </w:tcBorders>
+            <w:tcMar>
+              <w:top w:w="100" w:type="dxa"/>
+              <w:left w:w="100" w:type="dxa"/>
+              <w:bottom w:w="100" w:type="dxa"/>
+              <w:right w:w="100" w:type="dxa"/>
+            </w:tcMar>
+            <w:vAlign w:val="center"/>
+          </w:tcPr>
+          <w:p>
+            <w:pPr>
+              <w:pStyle w:val="Ttulo2"/>
               <w:rPr>
                 <w:color w:val="000000"/>
-                <w:highlight w:val="white"/>
-              </w:rPr>
-              <w:t>sistema</w:t>
-            </w:r>
-            <w:proofErr w:type="spellEnd"/>
+              </w:rPr>
+            </w:pPr>
+            <w:proofErr w:type="spellStart"/>
             <w:r>
               <w:rPr>
                 <w:color w:val="000000"/>
-                <w:highlight w:val="white"/>
-              </w:rPr>
-              <w:t xml:space="preserve"> muestra</w:t>
-            </w:r>
-            <w:r>
-              <w:rPr>
+              </w:rPr>
+              <w:t>Escenario 2</w:t>
+            </w:r>
+            <w:proofErr w:type="spellEnd"/>
+          </w:p>
+        </w:tc>
+        <w:tc>
+          <w:tcPr>
+            <w:tcW w:w="3405" w:type="dxa"/>
+            <w:gridSpan w:val="2"/>
+            <w:tcBorders>
+              <w:top w:val="single" w:sz="5" w:space="0" w:color="000000"/>
+              <w:left w:val="single" w:sz="5" w:space="0" w:color="000000"/>
+              <w:bottom w:val="single" w:sz="5" w:space="0" w:color="000000"/>
+              <w:right w:val="single" w:sz="5" w:space="0" w:color="000000"/>
+            </w:tcBorders>
+            <w:tcMar>
+              <w:top w:w="100" w:type="dxa"/>
+              <w:left w:w="100" w:type="dxa"/>
+              <w:bottom w:w="100" w:type="dxa"/>
+              <w:right w:w="100" w:type="dxa"/>
+            </w:tcMar>
+            <w:vAlign w:val="center"/>
+          </w:tcPr>
+          <w:p>
+            <w:pPr>
+              <w:pStyle w:val="Ttulo2"/>
+              <w:rPr>
+                <w:b w:val="0"/>
+                <w:bCs w:val="0"/>
                 <w:color w:val="000000"/>
               </w:rPr>
-              <w:t xml:space="preserve"> </w:t>
-            </w:r>
-            <w:proofErr w:type="spellStart"/>
-            <w:r>
-              <w:rPr>
+            </w:pPr>
+            <w:proofErr w:type="spellStart"/>
+            <w:r>
+              <w:rPr>
+                <w:b w:val="0"/>
+                <w:bCs w:val="0"/>
                 <w:color w:val="000000"/>
               </w:rPr>
-              <w:t>el</w:t>
-            </w:r>
-            <w:proofErr w:type="spellEnd"/>
-            <w:r>
+              <w:t>Usuario bloqueado</w:t>
+            </w:r>
+            <w:proofErr w:type="spellEnd"/>
+            <w:proofErr w:type="spellStart"/>
+            <w:proofErr w:type="spellEnd"/>
+            <w:proofErr w:type="spellStart"/>
+            <w:proofErr w:type="spellEnd"/>
+          </w:p>
+        </w:tc>
+        <w:tc>
+          <w:tcPr>
+            <w:tcW w:w="1500" w:type="dxa"/>
+            <w:tcBorders>
+              <w:top w:val="single" w:sz="5" w:space="0" w:color="000000"/>
+              <w:left w:val="single" w:sz="5" w:space="0" w:color="000000"/>
+              <w:bottom w:val="single" w:sz="5" w:space="0" w:color="000000"/>
+              <w:right w:val="single" w:sz="5" w:space="0" w:color="000000"/>
+            </w:tcBorders>
+            <w:tcMar>
+              <w:top w:w="100" w:type="dxa"/>
+              <w:left w:w="100" w:type="dxa"/>
+              <w:bottom w:w="100" w:type="dxa"/>
+              <w:right w:w="100" w:type="dxa"/>
+            </w:tcMar>
+            <w:vAlign w:val="center"/>
+          </w:tcPr>
+          <w:p>
+            <w:pPr>
+              <w:ind w:left="100"/>
+              <w:jc w:val="center"/>
+              <w:rPr>
+                <w:b/>
+                <w:bCs/>
+              </w:rPr>
+            </w:pPr>
+          </w:p>
+        </w:tc>
+        <w:tc>
+          <w:tcPr>
+            <w:tcW w:w="3843" w:type="dxa"/>
+            <w:tcBorders>
+              <w:top w:val="single" w:sz="5" w:space="0" w:color="000000"/>
+              <w:left w:val="single" w:sz="5" w:space="0" w:color="000000"/>
+              <w:bottom w:val="single" w:sz="5" w:space="0" w:color="000000"/>
+              <w:right w:val="single" w:sz="5" w:space="0" w:color="000000"/>
+            </w:tcBorders>
+            <w:tcMar>
+              <w:top w:w="100" w:type="dxa"/>
+              <w:left w:w="100" w:type="dxa"/>
+              <w:bottom w:w="100" w:type="dxa"/>
+              <w:right w:w="100" w:type="dxa"/>
+            </w:tcMar>
+            <w:vAlign w:val="center"/>
+          </w:tcPr>
+          <w:p>
+            <w:pPr>
+              <w:ind w:left="100"/>
+            </w:pPr>
+          </w:p>
+        </w:tc>
+      </w:tr>
+      <w:tr>
+        <w:trPr>
+          <w:trHeight w:val="735"/>
+        </w:trPr>
+        <w:tc>
+          <w:tcPr>
+            <w:tcW w:w="1560" w:type="dxa"/>
+            <w:vMerge w:val="restart"/>
+            <w:tcBorders>
+              <w:top w:val="single" w:sz="5" w:space="0" w:color="000000"/>
+              <w:left w:val="single" w:sz="4" w:space="0" w:color="000000"/>
+              <w:bottom w:val="single" w:sz="5" w:space="0" w:color="000000"/>
+              <w:right w:val="single" w:sz="5" w:space="0" w:color="000000"/>
+            </w:tcBorders>
+            <w:tcMar>
+              <w:top w:w="100" w:type="dxa"/>
+              <w:left w:w="100" w:type="dxa"/>
+              <w:bottom w:w="100" w:type="dxa"/>
+              <w:right w:w="100" w:type="dxa"/>
+            </w:tcMar>
+            <w:vAlign w:val="center"/>
+          </w:tcPr>
+          <w:p>
+            <w:pPr>
+              <w:ind w:left="100"/>
+              <w:jc w:val="center"/>
+              <w:rPr>
+                <w:b/>
+                <w:bCs/>
+              </w:rPr>
+            </w:pPr>
+            <w:proofErr w:type="spellStart"/>
+            <w:r>
+              <w:rPr>
+                <w:b/>
+                <w:bCs/>
+              </w:rPr>
+              <w:t>Criterio</w:t>
+            </w:r>
+            <w:proofErr w:type="spellEnd"/>
+            <w:r>
+              <w:rPr>
+                <w:b/>
+                <w:bCs/>
+              </w:rPr>
+              <w:t xml:space="preserve"> de </w:t>
+            </w:r>
+            <w:proofErr w:type="spellStart"/>
+            <w:r>
+              <w:rPr>
+                <w:b/>
+                <w:bCs/>
+              </w:rPr>
+              <w:t>aceptación</w:t>
+            </w:r>
+            <w:proofErr w:type="spellEnd"/>
+            <w:r>
+              <w:rPr>
+                <w:b/>
+                <w:bCs/>
+              </w:rPr>
+              <w:t xml:space="preserve"> 1</w:t>
+            </w:r>
+          </w:p>
+        </w:tc>
+        <w:tc>
+          <w:tcPr>
+            <w:tcW w:w="1110" w:type="dxa"/>
+            <w:tcBorders>
+              <w:top w:val="single" w:sz="5" w:space="0" w:color="000000"/>
+              <w:left w:val="single" w:sz="5" w:space="0" w:color="000000"/>
+              <w:bottom w:val="single" w:sz="5" w:space="0" w:color="000000"/>
+              <w:right w:val="single" w:sz="5" w:space="0" w:color="000000"/>
+            </w:tcBorders>
+            <w:tcMar>
+              <w:top w:w="100" w:type="dxa"/>
+              <w:left w:w="100" w:type="dxa"/>
+              <w:bottom w:w="100" w:type="dxa"/>
+              <w:right w:w="100" w:type="dxa"/>
+            </w:tcMar>
+            <w:vAlign w:val="center"/>
+          </w:tcPr>
+          <w:p>
+            <w:pPr>
+              <w:ind w:left="100"/>
+              <w:jc w:val="center"/>
+              <w:rPr>
+                <w:b/>
+                <w:bCs/>
+              </w:rPr>
+            </w:pPr>
+            <w:r>
+              <w:rPr>
+                <w:b/>
+                <w:bCs/>
+              </w:rPr>
+              <w:t>Given</w:t>
+            </w:r>
+          </w:p>
+        </w:tc>
+        <w:tc>
+          <w:tcPr>
+            <w:tcW w:w="7638" w:type="dxa"/>
+            <w:gridSpan w:val="3"/>
+            <w:tcBorders>
+              <w:top w:val="single" w:sz="5" w:space="0" w:color="000000"/>
+              <w:left w:val="single" w:sz="5" w:space="0" w:color="000000"/>
+              <w:bottom w:val="single" w:sz="5" w:space="0" w:color="000000"/>
+              <w:right w:val="single" w:sz="5" w:space="0" w:color="000000"/>
+            </w:tcBorders>
+            <w:tcMar>
+              <w:top w:w="100" w:type="dxa"/>
+              <w:left w:w="100" w:type="dxa"/>
+              <w:bottom w:w="100" w:type="dxa"/>
+              <w:right w:w="100" w:type="dxa"/>
+            </w:tcMar>
+            <w:vAlign w:val="center"/>
+          </w:tcPr>
+          <w:p>
+            <w:pPr>
+              <w:rPr>
+                <w:highlight w:val="white"/>
+              </w:rPr>
+            </w:pPr>
+            <w:r>
+              <w:rPr>
+                <w:highlight w:val="white"/>
+              </w:rPr>
+              <w:t>El usuario se encuentra en la vista de login</w:t>
+            </w:r>
+            <w:proofErr w:type="spellStart"/>
+            <w:proofErr w:type="spellEnd"/>
+            <w:proofErr w:type="spellStart"/>
+            <w:proofErr w:type="spellEnd"/>
+          </w:p>
+        </w:tc>
+      </w:tr>
+      <w:tr>
+        <w:trPr>
+          <w:trHeight w:val="735"/>
+        </w:trPr>
+        <w:tc>
+          <w:tcPr>
+            <w:tcW w:w="1560" w:type="dxa"/>
+            <w:vMerge/>
+            <w:tcBorders>
+              <w:top w:val="single" w:sz="5" w:space="0" w:color="000000"/>
+              <w:left w:val="single" w:sz="4" w:space="0" w:color="000000"/>
+              <w:bottom w:val="single" w:sz="5" w:space="0" w:color="000000"/>
+              <w:right w:val="single" w:sz="5" w:space="0" w:color="000000"/>
+            </w:tcBorders>
+            <w:tcMar>
+              <w:top w:w="100" w:type="dxa"/>
+              <w:left w:w="100" w:type="dxa"/>
+              <w:bottom w:w="100" w:type="dxa"/>
+              <w:right w:w="100" w:type="dxa"/>
+            </w:tcMar>
+            <w:vAlign w:val="center"/>
+          </w:tcPr>
+          <w:p>
+            <w:pPr>
+              <w:widowControl w:val="0"/>
+              <w:pBdr>
+                <w:top w:val="nil"/>
+                <w:left w:val="nil"/>
+                <w:bottom w:val="nil"/>
+                <w:right w:val="nil"/>
+                <w:between w:val="nil"/>
+              </w:pBdr>
+              <w:spacing w:after="0"/>
+              <w:rPr>
+                <w:highlight w:val="white"/>
+              </w:rPr>
+            </w:pPr>
+          </w:p>
+        </w:tc>
+        <w:tc>
+          <w:tcPr>
+            <w:tcW w:w="1110" w:type="dxa"/>
+            <w:tcBorders>
+              <w:top w:val="single" w:sz="5" w:space="0" w:color="000000"/>
+              <w:left w:val="single" w:sz="5" w:space="0" w:color="000000"/>
+              <w:bottom w:val="single" w:sz="5" w:space="0" w:color="000000"/>
+              <w:right w:val="single" w:sz="5" w:space="0" w:color="000000"/>
+            </w:tcBorders>
+            <w:tcMar>
+              <w:top w:w="100" w:type="dxa"/>
+              <w:left w:w="100" w:type="dxa"/>
+              <w:bottom w:w="100" w:type="dxa"/>
+              <w:right w:w="100" w:type="dxa"/>
+            </w:tcMar>
+            <w:vAlign w:val="center"/>
+          </w:tcPr>
+          <w:p>
+            <w:pPr>
+              <w:ind w:left="100"/>
+              <w:jc w:val="center"/>
+              <w:rPr>
+                <w:b/>
+                <w:bCs/>
+              </w:rPr>
+            </w:pPr>
+            <w:r>
+              <w:rPr>
+                <w:b/>
+                <w:bCs/>
+              </w:rPr>
+              <w:t>When</w:t>
+            </w:r>
+          </w:p>
+        </w:tc>
+        <w:tc>
+          <w:tcPr>
+            <w:tcW w:w="7638" w:type="dxa"/>
+            <w:gridSpan w:val="3"/>
+            <w:tcBorders>
+              <w:top w:val="single" w:sz="5" w:space="0" w:color="000000"/>
+              <w:left w:val="single" w:sz="5" w:space="0" w:color="000000"/>
+              <w:bottom w:val="single" w:sz="5" w:space="0" w:color="000000"/>
+              <w:right w:val="single" w:sz="5" w:space="0" w:color="000000"/>
+            </w:tcBorders>
+            <w:tcMar>
+              <w:top w:w="100" w:type="dxa"/>
+              <w:left w:w="100" w:type="dxa"/>
+              <w:bottom w:w="100" w:type="dxa"/>
+              <w:right w:w="100" w:type="dxa"/>
+            </w:tcMar>
+            <w:vAlign w:val="center"/>
+          </w:tcPr>
+          <w:p>
+            <w:pPr>
+              <w:rPr>
+                <w:highlight w:val="white"/>
+              </w:rPr>
+            </w:pPr>
+            <w:r>
+              <w:rPr>
+                <w:highlight w:val="white"/>
+              </w:rPr>
+              <w:t>El usuario ingresa las credenciales de un usuario bloqueado (locked_out_user) y da clic sobre el botón Login</w:t>
+            </w:r>
+            <w:proofErr w:type="gramStart"/>
+            <w:proofErr w:type="spellStart"/>
+            <w:proofErr w:type="spellEnd"/>
+            <w:proofErr w:type="gramEnd"/>
+            <w:proofErr w:type="spellStart"/>
+            <w:proofErr w:type="spellEnd"/>
+            <w:proofErr w:type="spellStart"/>
+            <w:proofErr w:type="spellEnd"/>
+          </w:p>
+        </w:tc>
+      </w:tr>
+      <w:tr>
+        <w:trPr>
+          <w:trHeight w:val="735"/>
+        </w:trPr>
+        <w:tc>
+          <w:tcPr>
+            <w:tcW w:w="1560" w:type="dxa"/>
+            <w:vMerge/>
+            <w:tcBorders>
+              <w:top w:val="single" w:sz="5" w:space="0" w:color="000000"/>
+              <w:left w:val="single" w:sz="4" w:space="0" w:color="000000"/>
+              <w:bottom w:val="single" w:sz="5" w:space="0" w:color="000000"/>
+              <w:right w:val="single" w:sz="5" w:space="0" w:color="000000"/>
+            </w:tcBorders>
+            <w:tcMar>
+              <w:top w:w="100" w:type="dxa"/>
+              <w:left w:w="100" w:type="dxa"/>
+              <w:bottom w:w="100" w:type="dxa"/>
+              <w:right w:w="100" w:type="dxa"/>
+            </w:tcMar>
+            <w:vAlign w:val="center"/>
+          </w:tcPr>
+          <w:p>
+            <w:pPr>
+              <w:widowControl w:val="0"/>
+              <w:pBdr>
+                <w:top w:val="nil"/>
+                <w:left w:val="nil"/>
+                <w:bottom w:val="nil"/>
+                <w:right w:val="nil"/>
+                <w:between w:val="nil"/>
+              </w:pBdr>
+              <w:spacing w:after="0"/>
+              <w:rPr>
+                <w:highlight w:val="white"/>
+              </w:rPr>
+            </w:pPr>
+          </w:p>
+        </w:tc>
+        <w:tc>
+          <w:tcPr>
+            <w:tcW w:w="1110" w:type="dxa"/>
+            <w:tcBorders>
+              <w:top w:val="single" w:sz="5" w:space="0" w:color="000000"/>
+              <w:left w:val="single" w:sz="5" w:space="0" w:color="000000"/>
+              <w:bottom w:val="single" w:sz="5" w:space="0" w:color="000000"/>
+              <w:right w:val="single" w:sz="5" w:space="0" w:color="000000"/>
+            </w:tcBorders>
+            <w:tcMar>
+              <w:top w:w="100" w:type="dxa"/>
+              <w:left w:w="100" w:type="dxa"/>
+              <w:bottom w:w="100" w:type="dxa"/>
+              <w:right w:w="100" w:type="dxa"/>
+            </w:tcMar>
+            <w:vAlign w:val="center"/>
+          </w:tcPr>
+          <w:p>
+            <w:pPr>
+              <w:ind w:left="100"/>
+              <w:jc w:val="center"/>
+              <w:rPr>
+                <w:b/>
+                <w:bCs/>
+              </w:rPr>
+            </w:pPr>
+            <w:r>
+              <w:rPr>
+                <w:b/>
+                <w:bCs/>
+              </w:rPr>
+              <w:t>Then</w:t>
+            </w:r>
+          </w:p>
+        </w:tc>
+        <w:tc>
+          <w:tcPr>
+            <w:tcW w:w="7638" w:type="dxa"/>
+            <w:gridSpan w:val="3"/>
+            <w:tcBorders>
+              <w:top w:val="single" w:sz="5" w:space="0" w:color="000000"/>
+              <w:left w:val="single" w:sz="5" w:space="0" w:color="000000"/>
+              <w:bottom w:val="single" w:sz="5" w:space="0" w:color="000000"/>
+              <w:right w:val="single" w:sz="5" w:space="0" w:color="000000"/>
+            </w:tcBorders>
+            <w:tcMar>
+              <w:top w:w="100" w:type="dxa"/>
+              <w:left w:w="100" w:type="dxa"/>
+              <w:bottom w:w="100" w:type="dxa"/>
+              <w:right w:w="100" w:type="dxa"/>
+            </w:tcMar>
+            <w:vAlign w:val="center"/>
+          </w:tcPr>
+          <w:p>
+            <w:pPr>
+              <w:pBdr>
+                <w:top w:val="nil"/>
+                <w:left w:val="nil"/>
+                <w:bottom w:val="nil"/>
+                <w:right w:val="nil"/>
+                <w:between w:val="nil"/>
+              </w:pBdr>
+              <w:ind w:left="360" w:hanging="360"/>
               <w:rPr>
                 <w:color w:val="000000"/>
               </w:rPr>
-              <w:t xml:space="preserve"> </w:t>
-            </w:r>
-            <w:proofErr w:type="spellStart"/>
+            </w:pPr>
             <w:r>
               <w:rPr>
                 <w:color w:val="000000"/>
-              </w:rPr>
-              <w:t>mensaje</w:t>
-            </w:r>
-            <w:proofErr w:type="spellEnd"/>
-            <w:r>
-              <w:rPr>
-                <w:color w:val="000000"/>
-              </w:rPr>
-              <w:t xml:space="preserve"> "Sorry, this user has been locked out."</w:t>
-            </w:r>
+                <w:highlight w:val="white"/>
+              </w:rPr>
+              <w:t>El sistema muestra el mensaje "Sorry, this user has been locked out." y no permite el acceso</w:t>
+            </w:r>
+            <w:proofErr w:type="spellStart"/>
+            <w:proofErr w:type="spellEnd"/>
+            <w:proofErr w:type="spellStart"/>
+            <w:proofErr w:type="spellEnd"/>
+            <w:proofErr w:type="spellStart"/>
+            <w:proofErr w:type="spellEnd"/>
           </w:p>
         </w:tc>
       </w:tr>
@@ -1257,15 +1303,9 @@
               <w:rPr>
                 <w:color w:val="000000"/>
               </w:rPr>
-              <w:t>Escenario</w:t>
-            </w:r>
-            <w:proofErr w:type="spellEnd"/>
-            <w:r>
-              <w:rPr>
-                <w:color w:val="000000"/>
-              </w:rPr>
-              <w:t xml:space="preserve"> 2</w:t>
-            </w:r>
+              <w:t>Escenario 3</w:t>
+            </w:r>
+            <w:proofErr w:type="spellEnd"/>
           </w:p>
         </w:tc>
         <w:tc>
@@ -1505,36 +1545,12 @@
               <w:rPr>
                 <w:highlight w:val="white"/>
               </w:rPr>
-              <w:t xml:space="preserve">El usuario, se </w:t>
-            </w:r>
-            <w:proofErr w:type="spellStart"/>
-            <w:r>
-              <w:rPr>
-                <w:highlight w:val="white"/>
-              </w:rPr>
-              <w:t>encuentra</w:t>
-            </w:r>
-            <w:proofErr w:type="spellEnd"/>
-            <w:r>
-              <w:rPr>
-                <w:highlight w:val="white"/>
-              </w:rPr>
-              <w:t xml:space="preserve"> </w:t>
-            </w:r>
-            <w:proofErr w:type="spellStart"/>
-            <w:r>
-              <w:rPr>
-                <w:highlight w:val="white"/>
-              </w:rPr>
-              <w:t>en</w:t>
-            </w:r>
-            <w:proofErr w:type="spellEnd"/>
-            <w:r>
-              <w:rPr>
-                <w:highlight w:val="white"/>
-              </w:rPr>
-              <w:t xml:space="preserve"> la vista de login</w:t>
-            </w:r>
+              <w:t>El usuario se encuentra en la vista de login</w:t>
+            </w:r>
+            <w:proofErr w:type="spellStart"/>
+            <w:proofErr w:type="spellEnd"/>
+            <w:proofErr w:type="spellStart"/>
+            <w:proofErr w:type="spellEnd"/>
           </w:p>
         </w:tc>
       </w:tr>
@@ -1640,136 +1656,26 @@
               <w:rPr>
                 <w:highlight w:val="white"/>
               </w:rPr>
-              <w:t xml:space="preserve">El </w:t>
+              <w:t>El usuario deja los campos obligatorios vacíos y da clic sobre el botón Login</w:t>
             </w:r>
             <w:proofErr w:type="gramStart"/>
-            <w:r>
-              <w:rPr>
-                <w:highlight w:val="white"/>
-              </w:rPr>
-              <w:t xml:space="preserve">usuario  </w:t>
-            </w:r>
-            <w:proofErr w:type="spellStart"/>
-            <w:r>
-              <w:rPr>
-                <w:highlight w:val="white"/>
-              </w:rPr>
-              <w:t>deja</w:t>
-            </w:r>
+            <w:proofErr w:type="spellStart"/>
             <w:proofErr w:type="spellEnd"/>
             <w:proofErr w:type="gramEnd"/>
-            <w:r>
-              <w:rPr>
-                <w:highlight w:val="white"/>
-              </w:rPr>
-              <w:t xml:space="preserve"> </w:t>
-            </w:r>
-            <w:proofErr w:type="spellStart"/>
-            <w:r>
-              <w:rPr>
-                <w:highlight w:val="white"/>
-              </w:rPr>
-              <w:t>los</w:t>
-            </w:r>
-            <w:proofErr w:type="spellEnd"/>
-            <w:r>
-              <w:rPr>
-                <w:highlight w:val="white"/>
-              </w:rPr>
-              <w:t xml:space="preserve"> campos  </w:t>
-            </w:r>
-            <w:proofErr w:type="spellStart"/>
-            <w:r>
-              <w:rPr>
-                <w:highlight w:val="white"/>
-              </w:rPr>
-              <w:t>obligatorios</w:t>
-            </w:r>
-            <w:proofErr w:type="spellEnd"/>
-            <w:r>
-              <w:rPr>
-                <w:highlight w:val="white"/>
-              </w:rPr>
-              <w:t xml:space="preserve"> </w:t>
-            </w:r>
-            <w:proofErr w:type="spellStart"/>
-            <w:r>
-              <w:rPr>
-                <w:highlight w:val="white"/>
-              </w:rPr>
-              <w:t>vacíos</w:t>
-            </w:r>
-            <w:proofErr w:type="spellEnd"/>
-            <w:r>
-              <w:rPr>
-                <w:highlight w:val="white"/>
-              </w:rPr>
-              <w:t xml:space="preserve"> y da </w:t>
-            </w:r>
-            <w:proofErr w:type="spellStart"/>
-            <w:r>
-              <w:rPr>
-                <w:highlight w:val="white"/>
-              </w:rPr>
-              <w:t>clic</w:t>
-            </w:r>
-            <w:proofErr w:type="spellEnd"/>
-            <w:r>
-              <w:rPr>
-                <w:highlight w:val="white"/>
-              </w:rPr>
-              <w:t xml:space="preserve"> </w:t>
-            </w:r>
-            <w:proofErr w:type="spellStart"/>
-            <w:r>
-              <w:rPr>
-                <w:highlight w:val="white"/>
-              </w:rPr>
-              <w:t>sobre</w:t>
-            </w:r>
-            <w:proofErr w:type="spellEnd"/>
-            <w:r>
-              <w:rPr>
-                <w:highlight w:val="white"/>
-              </w:rPr>
-              <w:t xml:space="preserve"> </w:t>
-            </w:r>
-            <w:proofErr w:type="spellStart"/>
-            <w:r>
-              <w:rPr>
-                <w:highlight w:val="white"/>
-              </w:rPr>
-              <w:t>el</w:t>
-            </w:r>
-            <w:proofErr w:type="spellEnd"/>
-            <w:r>
-              <w:rPr>
-                <w:highlight w:val="white"/>
-              </w:rPr>
-              <w:t xml:space="preserve"> </w:t>
-            </w:r>
-            <w:proofErr w:type="spellStart"/>
-            <w:r>
-              <w:rPr>
-                <w:highlight w:val="white"/>
-              </w:rPr>
-              <w:t>botón</w:t>
-            </w:r>
-            <w:proofErr w:type="spellEnd"/>
-            <w:r>
-              <w:rPr>
-                <w:highlight w:val="white"/>
-              </w:rPr>
-              <w:t xml:space="preserve"> </w:t>
-            </w:r>
-            <w:r>
-              <w:rPr>
-                <w:b/>
-                <w:bCs/>
-                <w:highlight w:val="white"/>
-              </w:rPr>
-              <w:t>Login</w:t>
-            </w:r>
+            <w:proofErr w:type="spellStart"/>
+            <w:proofErr w:type="spellEnd"/>
+            <w:proofErr w:type="spellStart"/>
+            <w:proofErr w:type="spellEnd"/>
+            <w:proofErr w:type="spellStart"/>
+            <w:proofErr w:type="spellEnd"/>
+            <w:proofErr w:type="spellStart"/>
+            <w:proofErr w:type="spellEnd"/>
+            <w:proofErr w:type="spellStart"/>
+            <w:proofErr w:type="spellEnd"/>
+            <w:proofErr w:type="spellStart"/>
+            <w:proofErr w:type="spellEnd"/>
+            <w:proofErr w:type="spellStart"/>
+            <w:proofErr w:type="spellEnd"/>
           </w:p>
         </w:tc>
       </w:tr>
@@ -1992,15 +1898,9 @@
               <w:rPr>
                 <w:color w:val="000000"/>
               </w:rPr>
-              <w:t>Escenario</w:t>
-            </w:r>
-            <w:proofErr w:type="spellEnd"/>
-            <w:r>
-              <w:rPr>
-                <w:color w:val="000000"/>
-              </w:rPr>
-              <w:t xml:space="preserve"> 3</w:t>
-            </w:r>
+              <w:t>Escenario 4</w:t>
+            </w:r>
+            <w:proofErr w:type="spellEnd"/>
           </w:p>
         </w:tc>
         <w:tc>
@@ -2268,36 +2168,12 @@
               <w:rPr>
                 <w:highlight w:val="white"/>
               </w:rPr>
-              <w:t xml:space="preserve">El usuario, se </w:t>
-            </w:r>
-            <w:proofErr w:type="spellStart"/>
-            <w:r>
-              <w:rPr>
-                <w:highlight w:val="white"/>
-              </w:rPr>
-              <w:t>encuentra</w:t>
-            </w:r>
-            <w:proofErr w:type="spellEnd"/>
-            <w:r>
-              <w:rPr>
-                <w:highlight w:val="white"/>
-              </w:rPr>
-              <w:t xml:space="preserve"> </w:t>
-            </w:r>
-            <w:proofErr w:type="spellStart"/>
-            <w:r>
-              <w:rPr>
-                <w:highlight w:val="white"/>
-              </w:rPr>
-              <w:t>en</w:t>
-            </w:r>
-            <w:proofErr w:type="spellEnd"/>
-            <w:r>
-              <w:rPr>
-                <w:highlight w:val="white"/>
-              </w:rPr>
-              <w:t xml:space="preserve"> la vista de login</w:t>
-            </w:r>
+              <w:t>El usuario se encuentra en la vista de login</w:t>
+            </w:r>
+            <w:proofErr w:type="spellStart"/>
+            <w:proofErr w:type="spellEnd"/>
+            <w:proofErr w:type="spellStart"/>
+            <w:proofErr w:type="spellEnd"/>
           </w:p>
         </w:tc>
       </w:tr>
@@ -2647,15 +2523,9 @@
               <w:rPr>
                 <w:color w:val="000000"/>
               </w:rPr>
-              <w:t>Escenario</w:t>
-            </w:r>
-            <w:proofErr w:type="spellEnd"/>
-            <w:r>
-              <w:rPr>
-                <w:color w:val="000000"/>
-              </w:rPr>
-              <w:t xml:space="preserve"> 4    </w:t>
-            </w:r>
+              <w:t>Escenario 5</w:t>
+            </w:r>
+            <w:proofErr w:type="spellEnd"/>
           </w:p>
         </w:tc>
         <w:tc>
@@ -2893,65 +2763,17 @@
               <w:rPr>
                 <w:highlight w:val="white"/>
               </w:rPr>
-              <w:t xml:space="preserve">El usuario, se </w:t>
-            </w:r>
-            <w:proofErr w:type="spellStart"/>
-            <w:r>
-              <w:rPr>
-                <w:highlight w:val="white"/>
-              </w:rPr>
-              <w:t>encuentra</w:t>
-            </w:r>
-            <w:proofErr w:type="spellEnd"/>
-            <w:r>
-              <w:rPr>
-                <w:highlight w:val="white"/>
-              </w:rPr>
-              <w:t xml:space="preserve"> </w:t>
-            </w:r>
-            <w:proofErr w:type="spellStart"/>
-            <w:r>
-              <w:rPr>
-                <w:highlight w:val="white"/>
-              </w:rPr>
-              <w:t>en</w:t>
-            </w:r>
-            <w:proofErr w:type="spellEnd"/>
-            <w:r>
-              <w:rPr>
-                <w:highlight w:val="white"/>
-              </w:rPr>
-              <w:t xml:space="preserve"> la vista </w:t>
-            </w:r>
+              <w:t>El usuario se encuentra en la vista del catálogo</w:t>
+            </w:r>
+            <w:proofErr w:type="spellStart"/>
+            <w:proofErr w:type="spellEnd"/>
+            <w:proofErr w:type="spellStart"/>
+            <w:proofErr w:type="spellEnd"/>
             <w:proofErr w:type="gramStart"/>
-            <w:r>
-              <w:rPr>
-                <w:highlight w:val="white"/>
-              </w:rPr>
-              <w:t xml:space="preserve">de  </w:t>
-            </w:r>
-            <w:proofErr w:type="spellStart"/>
-            <w:r>
-              <w:rPr>
-                <w:highlight w:val="white"/>
-              </w:rPr>
-              <w:t>el</w:t>
-            </w:r>
+            <w:proofErr w:type="spellStart"/>
             <w:proofErr w:type="spellEnd"/>
             <w:proofErr w:type="gramEnd"/>
-            <w:r>
-              <w:rPr>
-                <w:highlight w:val="white"/>
-              </w:rPr>
-              <w:t xml:space="preserve"> </w:t>
-            </w:r>
-            <w:proofErr w:type="spellStart"/>
-            <w:r>
-              <w:rPr>
-                <w:highlight w:val="white"/>
-              </w:rPr>
-              <w:t>catalogo</w:t>
-            </w:r>
+            <w:proofErr w:type="spellStart"/>
             <w:proofErr w:type="spellEnd"/>
           </w:p>
         </w:tc>
@@ -3535,50 +3357,14 @@
               <w:rPr>
                 <w:highlight w:val="white"/>
               </w:rPr>
-              <w:t xml:space="preserve">El usuario </w:t>
-            </w:r>
-            <w:proofErr w:type="spellStart"/>
-            <w:r>
-              <w:rPr>
-                <w:highlight w:val="white"/>
-              </w:rPr>
-              <w:t>desplegar</w:t>
-            </w:r>
-            <w:proofErr w:type="spellEnd"/>
-            <w:r>
-              <w:rPr>
-                <w:highlight w:val="white"/>
-              </w:rPr>
-              <w:t xml:space="preserve"> </w:t>
-            </w:r>
-            <w:proofErr w:type="spellStart"/>
-            <w:r>
-              <w:rPr>
-                <w:highlight w:val="white"/>
-              </w:rPr>
-              <w:t>el</w:t>
-            </w:r>
-            <w:proofErr w:type="spellEnd"/>
-            <w:r>
-              <w:rPr>
-                <w:highlight w:val="white"/>
-              </w:rPr>
-              <w:t xml:space="preserve"> </w:t>
-            </w:r>
-            <w:proofErr w:type="spellStart"/>
-            <w:r>
-              <w:rPr>
-                <w:highlight w:val="white"/>
-              </w:rPr>
-              <w:t>menú</w:t>
-            </w:r>
-            <w:proofErr w:type="spellEnd"/>
-            <w:r>
-              <w:rPr>
-                <w:highlight w:val="white"/>
-              </w:rPr>
-              <w:t xml:space="preserve"> </w:t>
-            </w:r>
+              <w:t>El usuario desplegó el menú</w:t>
+            </w:r>
+            <w:proofErr w:type="spellStart"/>
+            <w:proofErr w:type="spellEnd"/>
+            <w:proofErr w:type="spellStart"/>
+            <w:proofErr w:type="spellEnd"/>
+            <w:proofErr w:type="spellStart"/>
+            <w:proofErr w:type="spellEnd"/>
           </w:p>
         </w:tc>
       </w:tr>
@@ -3838,40 +3624,12 @@
               <w:rPr>
                 <w:highlight w:val="white"/>
               </w:rPr>
-              <w:t xml:space="preserve">El </w:t>
+              <w:t>El sistema muestra la vista de login</w:t>
             </w:r>
             <w:proofErr w:type="spellStart"/>
             <w:proofErr w:type="gramStart"/>
-            <w:r>
-              <w:rPr>
-                <w:highlight w:val="white"/>
-              </w:rPr>
-              <w:t>sistema</w:t>
-            </w:r>
-            <w:proofErr w:type="spellEnd"/>
-            <w:r>
-              <w:rPr>
-                <w:highlight w:val="white"/>
-              </w:rPr>
-              <w:t xml:space="preserve"> </w:t>
-            </w:r>
-            <w:r>
-              <w:t xml:space="preserve"> muestra</w:t>
-            </w:r>
+            <w:proofErr w:type="spellEnd"/>
             <w:proofErr w:type="gramEnd"/>
-            <w:r>
-              <w:t xml:space="preserve"> la vista de </w:t>
-            </w:r>
-            <w:r>
-              <w:rPr>
-                <w:b/>
-                <w:bCs/>
-              </w:rPr>
-              <w:t xml:space="preserve"> login</w:t>
-            </w:r>
-            <w:r>
-              <w:t xml:space="preserve">  </w:t>
-            </w:r>
           </w:p>
         </w:tc>
       </w:tr>

</xml_diff>